<commit_message>
Prototype framing in outward docs; TODO refresh; audit round 5
- Project note (FR), mobility statement and host letter now carry the
  prototype-to-validated-instrument framing; their docx rebuilt
- TODO.md banner and stale items rewritten to current reality (Plan B
  signatures, Formulaire RGO 19 Oct hard deadline, calendar v3 dates,
  59,994 chars, 0 plan placeholders + 12 bibliography flags)
- CLAUDE.md: rule now names U+2014 instead of using the character
- New: 05-review/repo-audit-2026-10-06.md - full keep/finalize/change/
  delete verdict, mechanical checks (count, em-dash, citation sync),
  consistency matrix of the five load-bearing claims, named risks

Co-Authored-By: Claude Fable 5 <noreply@anthropic.com>
Claude-Session: https://claude.ai/code/session_01Pijyy83JyS8bJxoVQgxwZB
</commit_message>
<xml_diff>
--- a/04-other-documents/data-access/02-project-note.docx
+++ b/04-other-documents/data-access/02-project-note.docx
@@ -131,7 +131,13 @@
         <w:t xml:space="preserve"> </w:t>
       </w:r>
       <w:r>
-        <w:t xml:space="preserve">plateforme que j'ai développée (&gt;80 000 publications indexées).</w:t>
+        <w:t xml:space="preserve">le prototype que j'ai développé (recherche fédérée dans la littérature ouverte, criblage,</w:t>
+      </w:r>
+      <w:r>
+        <w:t xml:space="preserve"> </w:t>
+      </w:r>
+      <w:r>
+        <w:t xml:space="preserve">extraction avec provenance), que le projet transforme en instrument validé.</w:t>
       </w:r>
     </w:p>
     <w:p>

</xml_diff>

<commit_message>
Expand project note to 2 pages with GESICA lineage; finalize Desmettre/Larribau emails
- 02-project-note: new GESICA section (co-signed systematic review, source
  inventory, established working relationship, distinct ethics base), state
  anchors and baselines in the modelling/evaluation volets, explicit official
  CCER route with letter-of-collaboration + accord de principe ask; built as
  a 2-page A4 docx and PDF (internal heading stripped from the rendered doc)
- Emails 03/04: attachment line updated to 2 pages, reply-by set to Monday
  13 October, bracket placeholders turned into plain text so they are
  ready to send
- New 03-lettre-collaboration-draft.docx: editable letter body only, for
  attaching alongside the note

Co-Authored-By: Claude Fable 5 <noreply@anthropic.com>
Claude-Session: https://claude.ai/code/session_01Pijyy83JyS8bJxoVQgxwZB
</commit_message>
<xml_diff>
--- a/04-other-documents/data-access/02-project-note.docx
+++ b/04-other-documents/data-access/02-project-note.docx
@@ -2,15 +2,6 @@
 <file path=word/document.xml><?xml version="1.0" encoding="utf-8"?>
 <w:document xmlns:w="http://schemas.openxmlformats.org/wordprocessingml/2006/main" xmlns:m="http://schemas.openxmlformats.org/officeDocument/2006/math" xmlns:r="http://schemas.openxmlformats.org/officeDocument/2006/relationships" xmlns:o="urn:schemas-microsoft-com:office:office" xmlns:v="urn:schemas-microsoft-com:vml" xmlns:w10="urn:schemas-microsoft-com:office:word" xmlns:a="http://schemas.openxmlformats.org/drawingml/2006/main" xmlns:pic="http://schemas.openxmlformats.org/drawingml/2006/picture" xmlns:wp="http://schemas.openxmlformats.org/drawingml/2006/wordprocessingDrawing">
   <w:body>
-    <w:bookmarkStart w:id="25" w:name="X1ac2531bd988380c79ef858bece45653ba58593"/>
-    <w:p>
-      <w:pPr>
-        <w:pStyle w:val="Heading1"/>
-      </w:pPr>
-      <w:r>
-        <w:t xml:space="preserve">One-page project note: attach to the request</w:t>
-      </w:r>
-    </w:p>
     <w:p>
       <w:pPr>
         <w:pStyle w:val="FirstParagraph"/>
@@ -22,17 +13,25 @@
         </w:rPr>
         <w:t xml:space="preserve">COLDSTART - Prévoir les crises sanitaires quand les données locales manquent</w:t>
       </w:r>
-      <w:r>
-        <w:t xml:space="preserve"> </w:t>
-      </w:r>
-      <w:r>
-        <w:t xml:space="preserve">Candidature Ambizione FNS · Requérant : Dr Erol Orel · Hôte : Institut de santé globale, Faculté</w:t>
-      </w:r>
-      <w:r>
-        <w:t xml:space="preserve"> </w:t>
-      </w:r>
-      <w:r>
-        <w:t xml:space="preserve">de médecine, UNIGE (programme de recherche indépendant) · Durée : 4 ans</w:t>
+    </w:p>
+    <w:p>
+      <w:pPr>
+        <w:pStyle w:val="BodyText"/>
+      </w:pPr>
+      <w:r>
+        <w:t xml:space="preserve">Candidature Ambizione FNS (dépôt : 3 novembre 2026) · Requérant : Dr Erol Orel · Hôte :</w:t>
+      </w:r>
+      <w:r>
+        <w:t xml:space="preserve"> </w:t>
+      </w:r>
+      <w:r>
+        <w:t xml:space="preserve">Institut de santé globale, Faculté de médecine, UNIGE (programme de recherche indépendant) ·</w:t>
+      </w:r>
+      <w:r>
+        <w:t xml:space="preserve"> </w:t>
+      </w:r>
+      <w:r>
+        <w:t xml:space="preserve">Durée : 4 ans</w:t>
       </w:r>
     </w:p>
     <w:bookmarkStart w:id="20" w:name="le-problème"/>
@@ -49,19 +48,25 @@
         <w:pStyle w:val="FirstParagraph"/>
       </w:pPr>
       <w:r>
-        <w:t xml:space="preserve">Quand une crise sanitaire commence, les données locales nécessaires pour la prévoir n'existent pas</w:t>
-      </w:r>
-      <w:r>
-        <w:t xml:space="preserve"> </w:t>
-      </w:r>
-      <w:r>
-        <w:t xml:space="preserve">encore. Les modèles les plus performants exigent plusieurs années d'historique ; ils sont donc les</w:t>
-      </w:r>
-      <w:r>
-        <w:t xml:space="preserve"> </w:t>
-      </w:r>
-      <w:r>
-        <w:t xml:space="preserve">plus faibles exactement là où les décisions sont les plus coûteuses et les moins réversibles.</w:t>
+        <w:t xml:space="preserve">Quand une crise sanitaire commence, les données locales nécessaires pour la prévoir n’existent</w:t>
+      </w:r>
+      <w:r>
+        <w:t xml:space="preserve"> </w:t>
+      </w:r>
+      <w:r>
+        <w:t xml:space="preserve">pas encore. Les modèles les plus performants exigent plusieurs années d’historique ; ils sont</w:t>
+      </w:r>
+      <w:r>
+        <w:t xml:space="preserve"> </w:t>
+      </w:r>
+      <w:r>
+        <w:t xml:space="preserve">donc les plus faibles exactement là où les décisions - armer des ambulances, ouvrir des lits,</w:t>
+      </w:r>
+      <w:r>
+        <w:t xml:space="preserve"> </w:t>
+      </w:r>
+      <w:r>
+        <w:t xml:space="preserve">déclencher une escalade - sont les plus coûteuses et les moins réversibles.</w:t>
       </w:r>
     </w:p>
     <w:p>
@@ -69,35 +74,67 @@
         <w:pStyle w:val="BodyText"/>
       </w:pPr>
       <w:r>
-        <w:t xml:space="preserve">Il existe pourtant une information disponible dès le premier jour : la littérature publiée sur des</w:t>
-      </w:r>
-      <w:r>
-        <w:t xml:space="preserve"> </w:t>
-      </w:r>
-      <w:r>
-        <w:t xml:space="preserve">événements analogues - associations météo–demande, amplitudes de surcharge, paramètres de</w:t>
-      </w:r>
-      <w:r>
-        <w:t xml:space="preserve"> </w:t>
-      </w:r>
-      <w:r>
-        <w:t xml:space="preserve">transmission. Elle n'est pas utilisée quantitativement, parce que personne n'a établi si le faire</w:t>
-      </w:r>
-      <w:r>
-        <w:t xml:space="preserve"> </w:t>
-      </w:r>
-      <w:r>
-        <w:t xml:space="preserve">aide ou nuit.</w:t>
+        <w:t xml:space="preserve">Il existe pourtant une information quantitative disponible dès le premier jour : la littérature</w:t>
+      </w:r>
+      <w:r>
+        <w:t xml:space="preserve"> </w:t>
+      </w:r>
+      <w:r>
+        <w:t xml:space="preserve">publiée sur des événements analogues - associations météo–demande, amplitudes et délais de</w:t>
+      </w:r>
+      <w:r>
+        <w:t xml:space="preserve"> </w:t>
+      </w:r>
+      <w:r>
+        <w:t xml:space="preserve">surcharge, durées de séjour et occupation, paramètres de transmission. Elle n’est presque</w:t>
+      </w:r>
+      <w:r>
+        <w:t xml:space="preserve"> </w:t>
+      </w:r>
+      <w:r>
+        <w:t xml:space="preserve">jamais utilisée comme information a priori formelle, parce que personne n’a établi si le faire</w:t>
+      </w:r>
+      <w:r>
+        <w:t xml:space="preserve"> </w:t>
+      </w:r>
+      <w:r>
+        <w:t xml:space="preserve">aide ou nuit. C’est la question centrale du projet, posée de façon falsifiable : si les a</w:t>
+      </w:r>
+      <w:r>
+        <w:t xml:space="preserve"> </w:t>
+      </w:r>
+      <w:r>
+        <w:t xml:space="preserve">priori issus de la littérature n’améliorent pas la prévision, ou si leurs effets nuisibles ne</w:t>
+      </w:r>
+      <w:r>
+        <w:t xml:space="preserve"> </w:t>
+      </w:r>
+      <w:r>
+        <w:t xml:space="preserve">peuvent pas être détectés à temps, le projet l’établira aussi - et ce résultat-là serait</w:t>
+      </w:r>
+      <w:r>
+        <w:t xml:space="preserve"> </w:t>
+      </w:r>
+      <w:r>
+        <w:t xml:space="preserve">également utile.</w:t>
       </w:r>
     </w:p>
     <w:bookmarkEnd w:id="20"/>
-    <w:bookmarkStart w:id="21" w:name="ce-que-le-projet-fait"/>
+    <w:bookmarkStart w:id="21" w:name="X5b06531e1038da216ce341653d087d3a047c2b3"/>
     <w:p>
       <w:pPr>
         <w:pStyle w:val="Heading2"/>
       </w:pPr>
       <w:r>
-        <w:t xml:space="preserve">Ce que le projet fait</w:t>
+        <w:t xml:space="preserve">D’où vient le projet : la continuité avec GESICA</w:t>
+      </w:r>
+    </w:p>
+    <w:p>
+      <w:pPr>
+        <w:pStyle w:val="FirstParagraph"/>
+      </w:pPr>
+      <w:r>
+        <w:t xml:space="preserve">Le projet dérive en partie de notre travail commun dans GESICA, tout en s’en distinguant.</w:t>
       </w:r>
     </w:p>
     <w:p>
@@ -113,31 +150,43 @@
           <w:bCs/>
           <w:b/>
         </w:rPr>
-        <w:t xml:space="preserve">Extraction</w:t>
-      </w:r>
-      <w:r>
-        <w:t xml:space="preserve"> </w:t>
-      </w:r>
-      <w:r>
-        <w:t xml:space="preserve">- mesurer la fiabilité de l'extraction automatique de paramètres quantitatifs</w:t>
-      </w:r>
-      <w:r>
-        <w:t xml:space="preserve"> </w:t>
-      </w:r>
-      <w:r>
-        <w:t xml:space="preserve">depuis la littérature, et corriger le biais identifié. Le projet s'appuie sur LiteRev-Evidence,</w:t>
-      </w:r>
-      <w:r>
-        <w:t xml:space="preserve"> </w:t>
-      </w:r>
-      <w:r>
-        <w:t xml:space="preserve">le prototype que j'ai développé (recherche fédérée dans la littérature ouverte, criblage,</w:t>
-      </w:r>
-      <w:r>
-        <w:t xml:space="preserve"> </w:t>
-      </w:r>
-      <w:r>
-        <w:t xml:space="preserve">extraction avec provenance), que le projet transforme en instrument validé.</w:t>
+        <w:t xml:space="preserve">La revue systématique que nous avons co-signée</w:t>
+      </w:r>
+      <w:r>
+        <w:t xml:space="preserve"> </w:t>
+      </w:r>
+      <w:r>
+        <w:t xml:space="preserve">(intelligence artificielle en médecine</w:t>
+      </w:r>
+      <w:r>
+        <w:t xml:space="preserve"> </w:t>
+      </w:r>
+      <w:r>
+        <w:t xml:space="preserve">préhospitalière pour les catastrophes et urgences sanitaires, soumise en 2026) montre que la</w:t>
+      </w:r>
+      <w:r>
+        <w:t xml:space="preserve"> </w:t>
+      </w:r>
+      <w:r>
+        <w:t xml:space="preserve">prévision est la tâche la plus fréquemment abordée, et que l’incertitude, la transparence et</w:t>
+      </w:r>
+      <w:r>
+        <w:t xml:space="preserve"> </w:t>
+      </w:r>
+      <w:r>
+        <w:t xml:space="preserve">l’explicabilité y sont rarement traitées explicitement. COLDSTART attaque précisément ces</w:t>
+      </w:r>
+      <w:r>
+        <w:t xml:space="preserve"> </w:t>
+      </w:r>
+      <w:r>
+        <w:t xml:space="preserve">manques : incertitude propagée de bout en bout, règles d’évaluation pré-enregistrées,</w:t>
+      </w:r>
+      <w:r>
+        <w:t xml:space="preserve"> </w:t>
+      </w:r>
+      <w:r>
+        <w:t xml:space="preserve">bénéfice décisionnel comme critère final.</w:t>
       </w:r>
     </w:p>
     <w:p>
@@ -153,55 +202,25 @@
           <w:bCs/>
           <w:b/>
         </w:rPr>
-        <w:t xml:space="preserve">Modélisation</w:t>
-      </w:r>
-      <w:r>
-        <w:t xml:space="preserve"> </w:t>
-      </w:r>
-      <w:r>
-        <w:t xml:space="preserve">- représenter l'état du système de soins comme un</w:t>
-      </w:r>
-      <w:r>
-        <w:t xml:space="preserve"> </w:t>
-      </w:r>
-      <w:r>
-        <w:rPr>
-          <w:bCs/>
-          <w:b/>
-        </w:rPr>
-        <w:t xml:space="preserve">processus à régimes</w:t>
-      </w:r>
-      <w:r>
-        <w:rPr>
-          <w:bCs/>
-          <w:b/>
-        </w:rPr>
-        <w:t xml:space="preserve"> </w:t>
-      </w:r>
-      <w:r>
-        <w:rPr>
-          <w:bCs/>
-          <w:b/>
-        </w:rPr>
-        <w:t xml:space="preserve">latents</w:t>
-      </w:r>
-      <w:r>
-        <w:t xml:space="preserve"> </w:t>
-      </w:r>
-      <w:r>
-        <w:t xml:space="preserve">(habituel / tendu / sous tension / critique) plutôt que comme un seuil appliqué à une</w:t>
-      </w:r>
-      <w:r>
-        <w:t xml:space="preserve"> </w:t>
-      </w:r>
-      <w:r>
-        <w:t xml:space="preserve">prévision ponctuelle, avec une modélisation de la queue de distribution pour l'état critique.</w:t>
-      </w:r>
-      <w:r>
-        <w:t xml:space="preserve"> </w:t>
-      </w:r>
-      <w:r>
-        <w:t xml:space="preserve">Ces outils viennent de l'économétrie financière, où j'ai travaillé quinze ans.</w:t>
+        <w:t xml:space="preserve">L’inventaire GESICA des sources de données</w:t>
+      </w:r>
+      <w:r>
+        <w:t xml:space="preserve"> </w:t>
+      </w:r>
+      <w:r>
+        <w:t xml:space="preserve">(28 sources, infectieuses et non</w:t>
+      </w:r>
+      <w:r>
+        <w:t xml:space="preserve"> </w:t>
+      </w:r>
+      <w:r>
+        <w:t xml:space="preserve">infectieuses, sur GE–VD–NE) fournit la cartographie sur laquelle le protocole de données du</w:t>
+      </w:r>
+      <w:r>
+        <w:t xml:space="preserve"> </w:t>
+      </w:r>
+      <w:r>
+        <w:t xml:space="preserve">projet est construit.</w:t>
       </w:r>
     </w:p>
     <w:p>
@@ -217,192 +236,35 @@
           <w:bCs/>
           <w:b/>
         </w:rPr>
-        <w:t xml:space="preserve">Évaluation</w:t>
-      </w:r>
-      <w:r>
-        <w:t xml:space="preserve"> </w:t>
-      </w:r>
-      <w:r>
-        <w:t xml:space="preserve">- tester si les a priori issus de la littérature améliorent la prévision en</w:t>
-      </w:r>
-      <w:r>
-        <w:t xml:space="preserve"> </w:t>
-      </w:r>
-      <w:r>
-        <w:t xml:space="preserve">début de crise, en n'utilisant à chaque instant que les données</w:t>
-      </w:r>
-      <w:r>
-        <w:t xml:space="preserve"> </w:t>
-      </w:r>
-      <w:r>
-        <w:rPr>
-          <w:iCs/>
-          <w:i/>
-        </w:rPr>
-        <w:t xml:space="preserve">et la littérature</w:t>
-      </w:r>
-      <w:r>
-        <w:t xml:space="preserve"> </w:t>
-      </w:r>
-      <w:r>
-        <w:t xml:space="preserve">disponibles</w:t>
-      </w:r>
-      <w:r>
-        <w:t xml:space="preserve"> </w:t>
-      </w:r>
-      <w:r>
-        <w:t xml:space="preserve">à cette date.</w:t>
-      </w:r>
-    </w:p>
-    <w:p>
-      <w:pPr>
-        <w:numPr>
-          <w:ilvl w:val="0"/>
-          <w:numId w:val="1001"/>
-        </w:numPr>
-        <w:pStyle w:val="Compact"/>
-      </w:pPr>
-      <w:r>
-        <w:rPr>
-          <w:bCs/>
-          <w:b/>
-        </w:rPr>
-        <w:t xml:space="preserve">Décision</w:t>
-      </w:r>
-      <w:r>
-        <w:t xml:space="preserve"> </w:t>
-      </w:r>
-      <w:r>
-        <w:t xml:space="preserve">- évaluer non pas la précision statistique mais</w:t>
-      </w:r>
-      <w:r>
-        <w:t xml:space="preserve"> </w:t>
-      </w:r>
-      <w:r>
-        <w:rPr>
-          <w:bCs/>
-          <w:b/>
-        </w:rPr>
-        <w:t xml:space="preserve">le bénéfice décisionnel</w:t>
-      </w:r>
-      <w:r>
-        <w:t xml:space="preserve">, à</w:t>
-      </w:r>
-      <w:r>
-        <w:t xml:space="preserve"> </w:t>
-      </w:r>
-      <w:r>
-        <w:t xml:space="preserve">partir de seuils d'escalade recueillis auprès de celles et ceux qui agissent dessus.</w:t>
+        <w:t xml:space="preserve">La relation de travail est établie</w:t>
+      </w:r>
+      <w:r>
+        <w:t xml:space="preserve"> </w:t>
+      </w:r>
+      <w:r>
+        <w:t xml:space="preserve">: l’accès aux données de la centrale 144 existe déjà</w:t>
+      </w:r>
+      <w:r>
+        <w:t xml:space="preserve"> </w:t>
+      </w:r>
+      <w:r>
+        <w:t xml:space="preserve">dans le cadre de GESICA. COLDSTART est un projet distinct, avec sa propre question, son</w:t>
+      </w:r>
+      <w:r>
+        <w:t xml:space="preserve"> </w:t>
+      </w:r>
+      <w:r>
+        <w:t xml:space="preserve">propre requérant et sa propre base éthique ; il ne réutilise pas l’accès GESICA.</w:t>
       </w:r>
     </w:p>
     <w:bookmarkEnd w:id="21"/>
-    <w:bookmarkStart w:id="22" w:name="X5be847ac80c897fa107f88da90aaee5894ad77c"/>
+    <w:bookmarkStart w:id="22" w:name="X9ed6e14d854f09b15d072f72afbc3b2519be28c"/>
     <w:p>
       <w:pPr>
         <w:pStyle w:val="Heading2"/>
       </w:pPr>
       <w:r>
-        <w:t xml:space="preserve">Ce que je demanderais aux HUG / à la CASU 144</w:t>
-      </w:r>
-    </w:p>
-    <w:p>
-      <w:pPr>
-        <w:pStyle w:val="FirstParagraph"/>
-      </w:pPr>
-      <w:r>
-        <w:t xml:space="preserve">Un</w:t>
-      </w:r>
-      <w:r>
-        <w:t xml:space="preserve"> </w:t>
-      </w:r>
-      <w:r>
-        <w:rPr>
-          <w:bCs/>
-          <w:b/>
-        </w:rPr>
-        <w:t xml:space="preserve">extrait rétrospectif agrégé au jour</w:t>
-      </w:r>
-      <w:r>
-        <w:t xml:space="preserve"> </w:t>
-      </w:r>
-      <w:r>
-        <w:t xml:space="preserve">: date, effectifs par motif de recours / catégorie</w:t>
-      </w:r>
-      <w:r>
-        <w:t xml:space="preserve"> </w:t>
-      </w:r>
-      <w:r>
-        <w:t xml:space="preserve">large et degré d'urgence (144), ou par catégorie de passage (urgences), idéalement par classe</w:t>
-      </w:r>
-      <w:r>
-        <w:t xml:space="preserve"> </w:t>
-      </w:r>
-      <w:r>
-        <w:t xml:space="preserve">d'âge large. Aucun identifiant direct, aucun texte libre. L'accès se ferait sous approbation</w:t>
-      </w:r>
-      <w:r>
-        <w:t xml:space="preserve"> </w:t>
-      </w:r>
-      <w:r>
-        <w:t xml:space="preserve">CCER, avec moi comme requérant. Les données de régulation du 144 constituent la</w:t>
-      </w:r>
-      <w:r>
-        <w:t xml:space="preserve"> </w:t>
-      </w:r>
-      <w:r>
-        <w:rPr>
-          <w:bCs/>
-          <w:b/>
-        </w:rPr>
-        <w:t xml:space="preserve">série d'issue</w:t>
-      </w:r>
-      <w:r>
-        <w:rPr>
-          <w:bCs/>
-          <w:b/>
-        </w:rPr>
-        <w:t xml:space="preserve"> </w:t>
-      </w:r>
-      <w:r>
-        <w:rPr>
-          <w:bCs/>
-          <w:b/>
-        </w:rPr>
-        <w:t xml:space="preserve">principale</w:t>
-      </w:r>
-      <w:r>
-        <w:t xml:space="preserve"> </w:t>
-      </w:r>
-      <w:r>
-        <w:t xml:space="preserve">; le critère principal est la demande à motif respiratoire, celui du volet canicule</w:t>
-      </w:r>
-      <w:r>
-        <w:t xml:space="preserve"> </w:t>
-      </w:r>
-      <w:r>
-        <w:t xml:space="preserve">la demande à motifs sensibles à la chaleur (déshydratation, rénal, psychiatrique) - d'où</w:t>
-      </w:r>
-      <w:r>
-        <w:t xml:space="preserve"> </w:t>
-      </w:r>
-      <w:r>
-        <w:t xml:space="preserve">l'importance de catégories de motifs couvrant les deux. Les passages aux urgences et l'occupation</w:t>
-      </w:r>
-      <w:r>
-        <w:t xml:space="preserve"> </w:t>
-      </w:r>
-      <w:r>
-        <w:t xml:space="preserve">des soins intensifs sont des canaux d'observation complémentaires.</w:t>
-      </w:r>
-    </w:p>
-    <w:bookmarkEnd w:id="22"/>
-    <w:bookmarkStart w:id="23" w:name="ce-que-vous-y-gagnez"/>
-    <w:p>
-      <w:pPr>
-        <w:pStyle w:val="Heading2"/>
-      </w:pPr>
-      <w:r>
-        <w:t xml:space="preserve">Ce que vous y gagnez</w:t>
+        <w:t xml:space="preserve">Ce que le projet fait (quatre volets, 48 mois)</w:t>
       </w:r>
     </w:p>
     <w:p>
@@ -414,13 +276,41 @@
         <w:pStyle w:val="Compact"/>
       </w:pPr>
       <w:r>
-        <w:t xml:space="preserve">Une évaluation indépendante de ce que valent réellement les prévisions précoces pour la</w:t>
-      </w:r>
-      <w:r>
-        <w:t xml:space="preserve"> </w:t>
-      </w:r>
-      <w:r>
-        <w:t xml:space="preserve">planification des ressources - y compris un résultat négatif, s'il est négatif.</w:t>
+        <w:rPr>
+          <w:bCs/>
+          <w:b/>
+        </w:rPr>
+        <w:t xml:space="preserve">Extraction</w:t>
+      </w:r>
+      <w:r>
+        <w:t xml:space="preserve"> </w:t>
+      </w:r>
+      <w:r>
+        <w:t xml:space="preserve">- mesurer la fiabilité de l’extraction automatique de paramètres</w:t>
+      </w:r>
+      <w:r>
+        <w:t xml:space="preserve"> </w:t>
+      </w:r>
+      <w:r>
+        <w:t xml:space="preserve">quantitatifs depuis la littérature (contre un étalon en double extraction humaine), et</w:t>
+      </w:r>
+      <w:r>
+        <w:t xml:space="preserve"> </w:t>
+      </w:r>
+      <w:r>
+        <w:t xml:space="preserve">corriger les biais identifiés. Le projet s’appuie sur LiteRev-Evidence, le prototype que</w:t>
+      </w:r>
+      <w:r>
+        <w:t xml:space="preserve"> </w:t>
+      </w:r>
+      <w:r>
+        <w:t xml:space="preserve">j’ai développé (recherche fédérée en direct dans la littérature ouverte, criblage,</w:t>
+      </w:r>
+      <w:r>
+        <w:t xml:space="preserve"> </w:t>
+      </w:r>
+      <w:r>
+        <w:t xml:space="preserve">extraction avec provenance), que le projet transforme en instrument validé.</w:t>
       </w:r>
     </w:p>
     <w:p>
@@ -432,7 +322,77 @@
         <w:pStyle w:val="Compact"/>
       </w:pPr>
       <w:r>
-        <w:t xml:space="preserve">Des seuils d'escalade explicités et documentés, construits avec vos équipes.</w:t>
+        <w:rPr>
+          <w:bCs/>
+          <w:b/>
+        </w:rPr>
+        <w:t xml:space="preserve">Modélisation</w:t>
+      </w:r>
+      <w:r>
+        <w:t xml:space="preserve"> </w:t>
+      </w:r>
+      <w:r>
+        <w:t xml:space="preserve">- représenter l’état du système de soins comme un</w:t>
+      </w:r>
+      <w:r>
+        <w:t xml:space="preserve"> </w:t>
+      </w:r>
+      <w:r>
+        <w:rPr>
+          <w:bCs/>
+          <w:b/>
+        </w:rPr>
+        <w:t xml:space="preserve">processus à régimes</w:t>
+      </w:r>
+      <w:r>
+        <w:rPr>
+          <w:bCs/>
+          <w:b/>
+        </w:rPr>
+        <w:t xml:space="preserve"> </w:t>
+      </w:r>
+      <w:r>
+        <w:rPr>
+          <w:bCs/>
+          <w:b/>
+        </w:rPr>
+        <w:t xml:space="preserve">latents</w:t>
+      </w:r>
+      <w:r>
+        <w:t xml:space="preserve"> </w:t>
+      </w:r>
+      <w:r>
+        <w:t xml:space="preserve">(habituel / tendu / sous tension / critique) plutôt que comme un seuil appliqué à</w:t>
+      </w:r>
+      <w:r>
+        <w:t xml:space="preserve"> </w:t>
+      </w:r>
+      <w:r>
+        <w:t xml:space="preserve">une prévision ponctuelle, avec une modélisation explicite de la queue de distribution pour</w:t>
+      </w:r>
+      <w:r>
+        <w:t xml:space="preserve"> </w:t>
+      </w:r>
+      <w:r>
+        <w:t xml:space="preserve">l’état critique. Les ancrages provisoires des états sont des percentiles de la demande</w:t>
+      </w:r>
+      <w:r>
+        <w:t xml:space="preserve"> </w:t>
+      </w:r>
+      <w:r>
+        <w:t xml:space="preserve">saisonnière et des indicateurs de capacité (occupation des soins intensifs, attente aux</w:t>
+      </w:r>
+      <w:r>
+        <w:t xml:space="preserve"> </w:t>
+      </w:r>
+      <w:r>
+        <w:t xml:space="preserve">urgences) ; ils sont affinés avec les équipes de terrain, pas imposés. Ces outils viennent</w:t>
+      </w:r>
+      <w:r>
+        <w:t xml:space="preserve"> </w:t>
+      </w:r>
+      <w:r>
+        <w:t xml:space="preserve">de l’économétrie financière, où j’ai travaillé quinze ans.</w:t>
       </w:r>
     </w:p>
     <w:p>
@@ -444,29 +404,57 @@
         <w:pStyle w:val="Compact"/>
       </w:pPr>
       <w:r>
-        <w:t xml:space="preserve">Un déploiement en</w:t>
-      </w:r>
-      <w:r>
-        <w:t xml:space="preserve"> </w:t>
-      </w:r>
-      <w:r>
-        <w:rPr>
-          <w:bCs/>
-          <w:b/>
-        </w:rPr>
-        <w:t xml:space="preserve">mode observation</w:t>
-      </w:r>
-      <w:r>
-        <w:t xml:space="preserve"> </w:t>
-      </w:r>
-      <w:r>
-        <w:t xml:space="preserve">en fin de projet : les prévisions sont enregistrées, non</w:t>
-      </w:r>
-      <w:r>
-        <w:t xml:space="preserve"> </w:t>
-      </w:r>
-      <w:r>
-        <w:t xml:space="preserve">utilisées pour décider - aucun impact clinique, aucune charge opérationnelle.</w:t>
+        <w:rPr>
+          <w:bCs/>
+          <w:b/>
+        </w:rPr>
+        <w:t xml:space="preserve">Évaluation</w:t>
+      </w:r>
+      <w:r>
+        <w:t xml:space="preserve"> </w:t>
+      </w:r>
+      <w:r>
+        <w:t xml:space="preserve">- tester, épisode historique par épisode historique, si les a priori issus</w:t>
+      </w:r>
+      <w:r>
+        <w:t xml:space="preserve"> </w:t>
+      </w:r>
+      <w:r>
+        <w:t xml:space="preserve">de la littérature améliorent la prévision en début de crise, en n’utilisant à chaque</w:t>
+      </w:r>
+      <w:r>
+        <w:t xml:space="preserve"> </w:t>
+      </w:r>
+      <w:r>
+        <w:t xml:space="preserve">instant que les données</w:t>
+      </w:r>
+      <w:r>
+        <w:t xml:space="preserve"> </w:t>
+      </w:r>
+      <w:r>
+        <w:rPr>
+          <w:iCs/>
+          <w:i/>
+        </w:rPr>
+        <w:t xml:space="preserve">et la littérature</w:t>
+      </w:r>
+      <w:r>
+        <w:t xml:space="preserve"> </w:t>
+      </w:r>
+      <w:r>
+        <w:t xml:space="preserve">disponibles à cette date (reconstruction</w:t>
+      </w:r>
+      <w:r>
+        <w:t xml:space="preserve"> </w:t>
+      </w:r>
+      <w:r>
+        <w:t xml:space="preserve">stricte de l’information), contre des références établies (modèles saisonniers,</w:t>
+      </w:r>
+      <w:r>
+        <w:t xml:space="preserve"> </w:t>
+      </w:r>
+      <w:r>
+        <w:t xml:space="preserve">algorithmes de surveillance, nowcasting bayésien).</w:t>
       </w:r>
     </w:p>
     <w:p>
@@ -478,11 +466,377 @@
         <w:pStyle w:val="Compact"/>
       </w:pPr>
       <w:r>
+        <w:rPr>
+          <w:bCs/>
+          <w:b/>
+        </w:rPr>
+        <w:t xml:space="preserve">Décision</w:t>
+      </w:r>
+      <w:r>
+        <w:t xml:space="preserve"> </w:t>
+      </w:r>
+      <w:r>
+        <w:t xml:space="preserve">- évaluer non pas la précision statistique mais</w:t>
+      </w:r>
+      <w:r>
+        <w:t xml:space="preserve"> </w:t>
+      </w:r>
+      <w:r>
+        <w:rPr>
+          <w:bCs/>
+          <w:b/>
+        </w:rPr>
+        <w:t xml:space="preserve">le bénéfice décisionnel</w:t>
+      </w:r>
+      <w:r>
+        <w:t xml:space="preserve">,</w:t>
+      </w:r>
+      <w:r>
+        <w:t xml:space="preserve"> </w:t>
+      </w:r>
+      <w:r>
+        <w:t xml:space="preserve">à partir de seuils d’escalade recueillis de façon structurée (protocole SHELF) auprès de</w:t>
+      </w:r>
+      <w:r>
+        <w:t xml:space="preserve"> </w:t>
+      </w:r>
+      <w:r>
+        <w:t xml:space="preserve">celles et ceux qui agissent dessus : régulateurs, urgentistes, gestion des capacités.</w:t>
+      </w:r>
+    </w:p>
+    <w:bookmarkEnd w:id="22"/>
+    <w:bookmarkStart w:id="23" w:name="X95ca0b96e4e96780cd1cd59bdc0e033b23de96a"/>
+    <w:p>
+      <w:pPr>
+        <w:pStyle w:val="Heading2"/>
+      </w:pPr>
+      <w:r>
+        <w:t xml:space="preserve">Les données : ce qui serait demandé, et par quelle voie</w:t>
+      </w:r>
+    </w:p>
+    <w:p>
+      <w:pPr>
+        <w:pStyle w:val="FirstParagraph"/>
+      </w:pPr>
+      <w:r>
+        <w:rPr>
+          <w:bCs/>
+          <w:b/>
+        </w:rPr>
+        <w:t xml:space="preserve">Ce qui serait demandé.</w:t>
+      </w:r>
+      <w:r>
+        <w:t xml:space="preserve"> </w:t>
+      </w:r>
+      <w:r>
+        <w:t xml:space="preserve">Un</w:t>
+      </w:r>
+      <w:r>
+        <w:t xml:space="preserve"> </w:t>
+      </w:r>
+      <w:r>
+        <w:rPr>
+          <w:bCs/>
+          <w:b/>
+        </w:rPr>
+        <w:t xml:space="preserve">extrait rétrospectif agrégé au jour</w:t>
+      </w:r>
+      <w:r>
+        <w:t xml:space="preserve"> </w:t>
+      </w:r>
+      <w:r>
+        <w:t xml:space="preserve">: date, effectifs par</w:t>
+      </w:r>
+      <w:r>
+        <w:t xml:space="preserve"> </w:t>
+      </w:r>
+      <w:r>
+        <w:t xml:space="preserve">motif de recours / catégorie large et degré d’urgence (144), ou par catégorie de passage</w:t>
+      </w:r>
+      <w:r>
+        <w:t xml:space="preserve"> </w:t>
+      </w:r>
+      <w:r>
+        <w:t xml:space="preserve">(urgences), idéalement par classe d’âge large.</w:t>
+      </w:r>
+      <w:r>
+        <w:t xml:space="preserve"> </w:t>
+      </w:r>
+      <w:r>
+        <w:rPr>
+          <w:bCs/>
+          <w:b/>
+        </w:rPr>
+        <w:t xml:space="preserve">Aucun identifiant direct, aucune donnée</w:t>
+      </w:r>
+      <w:r>
+        <w:rPr>
+          <w:bCs/>
+          <w:b/>
+        </w:rPr>
+        <w:t xml:space="preserve"> </w:t>
+      </w:r>
+      <w:r>
+        <w:rPr>
+          <w:bCs/>
+          <w:b/>
+        </w:rPr>
+        <w:t xml:space="preserve">individuelle, aucun enregistrement vocal, aucun texte libre.</w:t>
+      </w:r>
+      <w:r>
+        <w:t xml:space="preserve"> </w:t>
+      </w:r>
+      <w:r>
+        <w:t xml:space="preserve">Les données de régulation du</w:t>
+      </w:r>
+      <w:r>
+        <w:t xml:space="preserve"> </w:t>
+      </w:r>
+      <w:r>
+        <w:t xml:space="preserve">144 constituent la</w:t>
+      </w:r>
+      <w:r>
+        <w:t xml:space="preserve"> </w:t>
+      </w:r>
+      <w:r>
+        <w:rPr>
+          <w:bCs/>
+          <w:b/>
+        </w:rPr>
+        <w:t xml:space="preserve">série d’issue principale</w:t>
+      </w:r>
+      <w:r>
+        <w:t xml:space="preserve"> </w:t>
+      </w:r>
+      <w:r>
+        <w:t xml:space="preserve">; le critère principal est la demande à motif</w:t>
+      </w:r>
+      <w:r>
+        <w:t xml:space="preserve"> </w:t>
+      </w:r>
+      <w:r>
+        <w:t xml:space="preserve">respiratoire, celui du volet canicule la demande à motifs sensibles à la chaleur</w:t>
+      </w:r>
+      <w:r>
+        <w:t xml:space="preserve"> </w:t>
+      </w:r>
+      <w:r>
+        <w:t xml:space="preserve">(déshydratation, rénal, psychiatrique) - d’où l’importance de catégories de motifs couvrant</w:t>
+      </w:r>
+      <w:r>
+        <w:t xml:space="preserve"> </w:t>
+      </w:r>
+      <w:r>
+        <w:t xml:space="preserve">les deux. Les passages aux urgences et l’occupation des soins intensifs sont des canaux</w:t>
+      </w:r>
+      <w:r>
+        <w:t xml:space="preserve"> </w:t>
+      </w:r>
+      <w:r>
+        <w:t xml:space="preserve">d’observation complémentaires. Le périmètre est le canton de Genève au jour ; une validation</w:t>
+      </w:r>
+      <w:r>
+        <w:t xml:space="preserve"> </w:t>
+      </w:r>
+      <w:r>
+        <w:t xml:space="preserve">externe pré-spécifiée est prévue sur GE–VD–NE.</w:t>
+      </w:r>
+    </w:p>
+    <w:p>
+      <w:pPr>
+        <w:pStyle w:val="BodyText"/>
+      </w:pPr>
+      <w:r>
+        <w:rPr>
+          <w:bCs/>
+          <w:b/>
+        </w:rPr>
+        <w:t xml:space="preserve">Par quelle voie.</w:t>
+      </w:r>
+      <w:r>
+        <w:t xml:space="preserve"> </w:t>
+      </w:r>
+      <w:r>
+        <w:t xml:space="preserve">Rien n’est demandé aujourd’hui en matière de données. Si le projet est</w:t>
+      </w:r>
+      <w:r>
+        <w:t xml:space="preserve"> </w:t>
+      </w:r>
+      <w:r>
+        <w:t xml:space="preserve">financé, l’accès passerait par la</w:t>
+      </w:r>
+      <w:r>
+        <w:t xml:space="preserve"> </w:t>
+      </w:r>
+      <w:r>
+        <w:rPr>
+          <w:bCs/>
+          <w:b/>
+        </w:rPr>
+        <w:t xml:space="preserve">voie officielle : une soumission à la CCER, avec moi comme</w:t>
+      </w:r>
+      <w:r>
+        <w:rPr>
+          <w:bCs/>
+          <w:b/>
+        </w:rPr>
+        <w:t xml:space="preserve"> </w:t>
+      </w:r>
+      <w:r>
+        <w:rPr>
+          <w:bCs/>
+          <w:b/>
+        </w:rPr>
+        <w:t xml:space="preserve">requérant</w:t>
+      </w:r>
+      <w:r>
+        <w:t xml:space="preserve">, précédée des accords de données institutionnels nécessaires. Ce que j’espère de</w:t>
+      </w:r>
+      <w:r>
+        <w:t xml:space="preserve"> </w:t>
+      </w:r>
+      <w:r>
+        <w:t xml:space="preserve">votre part à ce stade est double : une</w:t>
+      </w:r>
+      <w:r>
+        <w:t xml:space="preserve"> </w:t>
+      </w:r>
+      <w:r>
+        <w:rPr>
+          <w:bCs/>
+          <w:b/>
+        </w:rPr>
+        <w:t xml:space="preserve">lettre de collaboration</w:t>
+      </w:r>
+      <w:r>
+        <w:t xml:space="preserve"> </w:t>
+      </w:r>
+      <w:r>
+        <w:t xml:space="preserve">pour le dossier FNS</w:t>
+      </w:r>
+      <w:r>
+        <w:t xml:space="preserve"> </w:t>
+      </w:r>
+      <w:r>
+        <w:t xml:space="preserve">(confirmant la collaboration et sa contribution concrète - le FNS écarte les lettres de</w:t>
+      </w:r>
+      <w:r>
+        <w:t xml:space="preserve"> </w:t>
+      </w:r>
+      <w:r>
+        <w:t xml:space="preserve">recommandation), et un</w:t>
+      </w:r>
+      <w:r>
+        <w:t xml:space="preserve"> </w:t>
+      </w:r>
+      <w:r>
+        <w:rPr>
+          <w:bCs/>
+          <w:b/>
+        </w:rPr>
+        <w:t xml:space="preserve">accord de principe</w:t>
+      </w:r>
+      <w:r>
+        <w:t xml:space="preserve"> </w:t>
+      </w:r>
+      <w:r>
+        <w:t xml:space="preserve">sur cette voie officielle le moment venu.</w:t>
+      </w:r>
+    </w:p>
+    <w:bookmarkEnd w:id="23"/>
+    <w:bookmarkStart w:id="24" w:name="ce-que-vous-y-gagnez"/>
+    <w:p>
+      <w:pPr>
+        <w:pStyle w:val="Heading2"/>
+      </w:pPr>
+      <w:r>
+        <w:t xml:space="preserve">Ce que vous y gagnez</w:t>
+      </w:r>
+    </w:p>
+    <w:p>
+      <w:pPr>
+        <w:numPr>
+          <w:ilvl w:val="0"/>
+          <w:numId w:val="1003"/>
+        </w:numPr>
+        <w:pStyle w:val="Compact"/>
+      </w:pPr>
+      <w:r>
+        <w:t xml:space="preserve">Une évaluation indépendante et pré-enregistrée de ce que valent réellement les prévisions</w:t>
+      </w:r>
+      <w:r>
+        <w:t xml:space="preserve"> </w:t>
+      </w:r>
+      <w:r>
+        <w:t xml:space="preserve">précoces pour la planification des ressources - y compris un résultat négatif, s’il est</w:t>
+      </w:r>
+      <w:r>
+        <w:t xml:space="preserve"> </w:t>
+      </w:r>
+      <w:r>
+        <w:t xml:space="preserve">négatif.</w:t>
+      </w:r>
+    </w:p>
+    <w:p>
+      <w:pPr>
+        <w:numPr>
+          <w:ilvl w:val="0"/>
+          <w:numId w:val="1003"/>
+        </w:numPr>
+        <w:pStyle w:val="Compact"/>
+      </w:pPr>
+      <w:r>
+        <w:t xml:space="preserve">Des seuils d’escalade explicités et documentés, construits avec vos équipes.</w:t>
+      </w:r>
+    </w:p>
+    <w:p>
+      <w:pPr>
+        <w:numPr>
+          <w:ilvl w:val="0"/>
+          <w:numId w:val="1003"/>
+        </w:numPr>
+        <w:pStyle w:val="Compact"/>
+      </w:pPr>
+      <w:r>
+        <w:t xml:space="preserve">Un déploiement en</w:t>
+      </w:r>
+      <w:r>
+        <w:t xml:space="preserve"> </w:t>
+      </w:r>
+      <w:r>
+        <w:rPr>
+          <w:bCs/>
+          <w:b/>
+        </w:rPr>
+        <w:t xml:space="preserve">mode observation</w:t>
+      </w:r>
+      <w:r>
+        <w:t xml:space="preserve"> </w:t>
+      </w:r>
+      <w:r>
+        <w:t xml:space="preserve">en fin de projet : les prévisions sont enregistrées,</w:t>
+      </w:r>
+      <w:r>
+        <w:t xml:space="preserve"> </w:t>
+      </w:r>
+      <w:r>
+        <w:t xml:space="preserve">non utilisées pour décider - aucun impact clinique, aucune charge opérationnelle.</w:t>
+      </w:r>
+    </w:p>
+    <w:p>
+      <w:pPr>
+        <w:numPr>
+          <w:ilvl w:val="0"/>
+          <w:numId w:val="1003"/>
+        </w:numPr>
+        <w:pStyle w:val="Compact"/>
+      </w:pPr>
+      <w:r>
         <w:t xml:space="preserve">Publications communes, dans la continuité de la revue systématique GESICA.</w:t>
       </w:r>
     </w:p>
-    <w:bookmarkEnd w:id="23"/>
-    <w:bookmarkStart w:id="24" w:name="calendrier"/>
+    <w:bookmarkEnd w:id="24"/>
+    <w:bookmarkStart w:id="25" w:name="calendrier"/>
     <w:p>
       <w:pPr>
         <w:pStyle w:val="Heading2"/>
@@ -504,10 +858,18 @@
       <w:r>
         <w:t xml:space="preserve">2027 · Décision : août 2027 · Début : entre le 1er septembre 2027 et le 1er septembre 2028.</w:t>
       </w:r>
-    </w:p>
-    <w:bookmarkEnd w:id="24"/>
+      <w:r>
+        <w:t xml:space="preserve"> </w:t>
+      </w:r>
+      <w:r>
+        <w:t xml:space="preserve">Pour le dossier : lettre de collaboration souhaitée d’ici la mi-octobre 2026.</w:t>
+      </w:r>
+    </w:p>
     <w:bookmarkEnd w:id="25"/>
-    <w:sectPr/>
+    <w:sectPr>
+      <w:pgSz w:w="11906" w:h="16838"/>
+      <w:pgMar w:top="850" w:right="964" w:bottom="850" w:left="964" w:header="708" w:footer="708" w:gutter="0"/>
+    </w:sectPr>
   </w:body>
 </w:document>
 </file>
@@ -613,6 +975,82 @@
       </w:pPr>
     </w:lvl>
   </w:abstractNum>
+  <w:abstractNum w:abstractNumId="991">
+    <w:nsid w:val="A991"/>
+    <w:multiLevelType w:val="multilevel"/>
+    <w:lvl w:ilvl="0">
+      <w:numFmt w:val="bullet"/>
+      <w:lvlText w:val="•"/>
+      <w:lvlJc w:val="left"/>
+      <w:pPr>
+        <w:ind w:left="720" w:hanging="480"/>
+      </w:pPr>
+    </w:lvl>
+    <w:lvl w:ilvl="1">
+      <w:numFmt w:val="bullet"/>
+      <w:lvlText w:val="–"/>
+      <w:lvlJc w:val="left"/>
+      <w:pPr>
+        <w:ind w:left="1440" w:hanging="480"/>
+      </w:pPr>
+    </w:lvl>
+    <w:lvl w:ilvl="2">
+      <w:numFmt w:val="bullet"/>
+      <w:lvlText w:val="•"/>
+      <w:lvlJc w:val="left"/>
+      <w:pPr>
+        <w:ind w:left="2160" w:hanging="480"/>
+      </w:pPr>
+    </w:lvl>
+    <w:lvl w:ilvl="3">
+      <w:numFmt w:val="bullet"/>
+      <w:lvlText w:val="–"/>
+      <w:lvlJc w:val="left"/>
+      <w:pPr>
+        <w:ind w:left="2880" w:hanging="480"/>
+      </w:pPr>
+    </w:lvl>
+    <w:lvl w:ilvl="4">
+      <w:numFmt w:val="bullet"/>
+      <w:lvlText w:val="•"/>
+      <w:lvlJc w:val="left"/>
+      <w:pPr>
+        <w:ind w:left="3600" w:hanging="480"/>
+      </w:pPr>
+    </w:lvl>
+    <w:lvl w:ilvl="5">
+      <w:numFmt w:val="bullet"/>
+      <w:lvlText w:val="–"/>
+      <w:lvlJc w:val="left"/>
+      <w:pPr>
+        <w:ind w:left="4320" w:hanging="480"/>
+      </w:pPr>
+    </w:lvl>
+    <w:lvl w:ilvl="6">
+      <w:numFmt w:val="bullet"/>
+      <w:lvlText w:val="•"/>
+      <w:lvlJc w:val="left"/>
+      <w:pPr>
+        <w:ind w:left="5040" w:hanging="480"/>
+      </w:pPr>
+    </w:lvl>
+    <w:lvl w:ilvl="7">
+      <w:numFmt w:val="bullet"/>
+      <w:lvlText w:val="–"/>
+      <w:lvlJc w:val="left"/>
+      <w:pPr>
+        <w:ind w:left="5760" w:hanging="480"/>
+      </w:pPr>
+    </w:lvl>
+    <w:lvl w:ilvl="8">
+      <w:numFmt w:val="bullet"/>
+      <w:lvlText w:val="•"/>
+      <w:lvlJc w:val="left"/>
+      <w:pPr>
+        <w:ind w:left="6480" w:hanging="480"/>
+      </w:pPr>
+    </w:lvl>
+  </w:abstractNum>
   <w:abstractNum w:abstractNumId="99411">
     <w:nsid w:val="A99411"/>
     <w:multiLevelType w:val="multilevel"/>
@@ -698,86 +1136,13 @@
       </w:pPr>
     </w:lvl>
   </w:abstractNum>
-  <w:abstractNum w:abstractNumId="991">
-    <w:nsid w:val="A991"/>
-    <w:multiLevelType w:val="multilevel"/>
-    <w:lvl w:ilvl="0">
-      <w:numFmt w:val="bullet"/>
-      <w:lvlText w:val="•"/>
-      <w:lvlJc w:val="left"/>
-      <w:pPr>
-        <w:ind w:left="720" w:hanging="480"/>
-      </w:pPr>
-    </w:lvl>
-    <w:lvl w:ilvl="1">
-      <w:numFmt w:val="bullet"/>
-      <w:lvlText w:val="–"/>
-      <w:lvlJc w:val="left"/>
-      <w:pPr>
-        <w:ind w:left="1440" w:hanging="480"/>
-      </w:pPr>
-    </w:lvl>
-    <w:lvl w:ilvl="2">
-      <w:numFmt w:val="bullet"/>
-      <w:lvlText w:val="•"/>
-      <w:lvlJc w:val="left"/>
-      <w:pPr>
-        <w:ind w:left="2160" w:hanging="480"/>
-      </w:pPr>
-    </w:lvl>
-    <w:lvl w:ilvl="3">
-      <w:numFmt w:val="bullet"/>
-      <w:lvlText w:val="–"/>
-      <w:lvlJc w:val="left"/>
-      <w:pPr>
-        <w:ind w:left="2880" w:hanging="480"/>
-      </w:pPr>
-    </w:lvl>
-    <w:lvl w:ilvl="4">
-      <w:numFmt w:val="bullet"/>
-      <w:lvlText w:val="•"/>
-      <w:lvlJc w:val="left"/>
-      <w:pPr>
-        <w:ind w:left="3600" w:hanging="480"/>
-      </w:pPr>
-    </w:lvl>
-    <w:lvl w:ilvl="5">
-      <w:numFmt w:val="bullet"/>
-      <w:lvlText w:val="–"/>
-      <w:lvlJc w:val="left"/>
-      <w:pPr>
-        <w:ind w:left="4320" w:hanging="480"/>
-      </w:pPr>
-    </w:lvl>
-    <w:lvl w:ilvl="6">
-      <w:numFmt w:val="bullet"/>
-      <w:lvlText w:val="•"/>
-      <w:lvlJc w:val="left"/>
-      <w:pPr>
-        <w:ind w:left="5040" w:hanging="480"/>
-      </w:pPr>
-    </w:lvl>
-    <w:lvl w:ilvl="7">
-      <w:numFmt w:val="bullet"/>
-      <w:lvlText w:val="–"/>
-      <w:lvlJc w:val="left"/>
-      <w:pPr>
-        <w:ind w:left="5760" w:hanging="480"/>
-      </w:pPr>
-    </w:lvl>
-    <w:lvl w:ilvl="8">
-      <w:numFmt w:val="bullet"/>
-      <w:lvlText w:val="•"/>
-      <w:lvlJc w:val="left"/>
-      <w:pPr>
-        <w:ind w:left="6480" w:hanging="480"/>
-      </w:pPr>
-    </w:lvl>
-  </w:abstractNum>
   <w:num w:numId="1000">
     <w:abstractNumId w:val="990"/>
   </w:num>
   <w:num w:numId="1001">
+    <w:abstractNumId w:val="991"/>
+  </w:num>
+  <w:num w:numId="1002">
     <w:abstractNumId w:val="99411"/>
     <w:lvlOverride w:ilvl="0">
       <w:startOverride w:val="1"/>
@@ -807,7 +1172,7 @@
       <w:startOverride w:val="1"/>
     </w:lvlOverride>
   </w:num>
-  <w:num w:numId="1002">
+  <w:num w:numId="1003">
     <w:abstractNumId w:val="991"/>
   </w:num>
 </w:numbering>
@@ -821,12 +1186,12 @@
         <w:rFonts w:asciiTheme="minorHAnsi" w:cstheme="minorBidi" w:eastAsiaTheme="minorHAnsi" w:hAnsiTheme="minorHAnsi"/>
         <w:sz w:val="24"/>
         <w:szCs w:val="24"/>
-        <w:lang w:bidi="ar-SA" w:eastAsia="en-US" w:val="en-US"/>
+        <w:lang w:bidi="ar-SA" w:eastAsia="en-US" w:val="fr"/>
       </w:rPr>
     </w:rPrDefault>
     <w:pPrDefault>
       <w:pPr>
-        <w:spacing w:after="200"/>
+        <w:spacing w:after="60"/>
       </w:pPr>
     </w:pPrDefault>
   </w:docDefaults>
@@ -840,7 +1205,7 @@
     <w:basedOn w:val="Normal"/>
     <w:link w:val="BodyTextChar"/>
     <w:pPr>
-      <w:spacing w:after="180" w:before="180"/>
+      <w:spacing w:after="60" w:before="120"/>
     </w:pPr>
     <w:qFormat/>
   </w:style>
@@ -866,7 +1231,7 @@
     <w:pPr>
       <w:keepNext/>
       <w:keepLines/>
-      <w:spacing w:after="240" w:before="480"/>
+      <w:spacing w:after="60" w:before="120"/>
       <w:jc w:val="center"/>
     </w:pPr>
     <w:rPr>
@@ -886,7 +1251,7 @@
     <w:pPr>
       <w:keepNext/>
       <w:keepLines/>
-      <w:spacing w:after="240" w:before="240"/>
+      <w:spacing w:after="60" w:before="120"/>
       <w:jc w:val="center"/>
     </w:pPr>
     <w:rPr>
@@ -923,7 +1288,7 @@
       <w:keepNext/>
       <w:keepLines/>
       <w:jc w:val="center"/>
-      <w:spacing w:after="0" w:before="300"/>
+      <w:spacing w:after="0" w:before="120"/>
     </w:pPr>
     <w:rPr>
       <w:sz w:val="20"/>
@@ -941,7 +1306,7 @@
     <w:pPr>
       <w:keepNext/>
       <w:keepLines/>
-      <w:spacing w:after="300" w:before="100"/>
+      <w:spacing w:after="60" w:before="100"/>
     </w:pPr>
     <w:rPr>
       <w:sz w:val="20"/>
@@ -965,7 +1330,7 @@
     <w:pPr>
       <w:keepNext/>
       <w:keepLines/>
-      <w:spacing w:after="0" w:before="480"/>
+      <w:spacing w:after="0" w:before="120"/>
       <w:outlineLvl w:val="0"/>
     </w:pPr>
     <w:rPr>
@@ -987,7 +1352,7 @@
     <w:pPr>
       <w:keepNext/>
       <w:keepLines/>
-      <w:spacing w:after="0" w:before="200"/>
+      <w:spacing w:after="0" w:before="120"/>
       <w:outlineLvl w:val="1"/>
     </w:pPr>
     <w:rPr>
@@ -1009,7 +1374,7 @@
     <w:pPr>
       <w:keepNext/>
       <w:keepLines/>
-      <w:spacing w:after="0" w:before="200"/>
+      <w:spacing w:after="0" w:before="120"/>
       <w:outlineLvl w:val="2"/>
     </w:pPr>
     <w:rPr>
@@ -1031,7 +1396,7 @@
     <w:pPr>
       <w:keepNext/>
       <w:keepLines/>
-      <w:spacing w:after="0" w:before="200"/>
+      <w:spacing w:after="0" w:before="120"/>
       <w:outlineLvl w:val="3"/>
     </w:pPr>
     <w:rPr>
@@ -1053,7 +1418,7 @@
     <w:pPr>
       <w:keepNext/>
       <w:keepLines/>
-      <w:spacing w:after="0" w:before="200"/>
+      <w:spacing w:after="0" w:before="120"/>
       <w:outlineLvl w:val="4"/>
     </w:pPr>
     <w:rPr>
@@ -1074,7 +1439,7 @@
     <w:pPr>
       <w:keepNext/>
       <w:keepLines/>
-      <w:spacing w:after="0" w:before="200"/>
+      <w:spacing w:after="0" w:before="120"/>
       <w:outlineLvl w:val="5"/>
     </w:pPr>
     <w:rPr>
@@ -1094,7 +1459,7 @@
     <w:pPr>
       <w:keepNext/>
       <w:keepLines/>
-      <w:spacing w:after="0" w:before="200"/>
+      <w:spacing w:after="0" w:before="120"/>
       <w:outlineLvl w:val="6"/>
     </w:pPr>
     <w:rPr>
@@ -1114,7 +1479,7 @@
     <w:pPr>
       <w:keepNext/>
       <w:keepLines/>
-      <w:spacing w:after="0" w:before="200"/>
+      <w:spacing w:after="0" w:before="120"/>
       <w:outlineLvl w:val="7"/>
     </w:pPr>
     <w:rPr>
@@ -1134,7 +1499,7 @@
     <w:pPr>
       <w:keepNext/>
       <w:keepLines/>
-      <w:spacing w:after="0" w:before="200"/>
+      <w:spacing w:after="0" w:before="120"/>
       <w:outlineLvl w:val="8"/>
     </w:pPr>
     <w:rPr>
@@ -1152,7 +1517,7 @@
     <w:unhideWhenUsed/>
     <w:qFormat/>
     <w:pPr>
-      <w:spacing w:after="100" w:before="100"/>
+      <w:spacing w:after="60" w:before="100"/>
       <w:ind w:firstLine="0" w:left="480" w:right="480"/>
     </w:pPr>
   </w:style>
@@ -1222,7 +1587,7 @@
     <w:basedOn w:val="Normal"/>
     <w:link w:val="BodyTextChar"/>
     <w:pPr>
-      <w:spacing w:after="120" w:before="0"/>
+      <w:spacing w:after="60" w:before="0"/>
     </w:pPr>
     <w:rPr>
       <w:i/>
@@ -1289,7 +1654,7 @@
     <w:unhideWhenUsed/>
     <w:qFormat/>
     <w:pPr>
-      <w:spacing w:before="240" w:line="259" w:lineRule="auto"/>
+      <w:spacing w:before="120" w:line="259" w:lineRule="auto"/>
       <w:outlineLvl w:val="9"/>
     </w:pPr>
     <w:rPr>

</xml_diff>

<commit_message>
Align ancillary documents with the frozen research plan
Reader-round dates and design description, project note anchors sentence
(docx/pdf rebuilt, 2 pages), second-applicant notes, frozen-state counts
in TODO/CALENDAR/CLAUDE.

Co-Authored-By: Claude Fable 5 <noreply@anthropic.com>
Claude-Session: https://claude.ai/code/session_01Pijyy83JyS8bJxoVQgxwZB
</commit_message>
<xml_diff>
--- a/04-other-documents/data-access/02-project-note.docx
+++ b/04-other-documents/data-access/02-project-note.docx
@@ -362,7 +362,7 @@
         <w:t xml:space="preserve"> </w:t>
       </w:r>
       <w:r>
-        <w:t xml:space="preserve">saisonnière et des indicateurs de capacité, affinés avec les équipes de terrain. Les</w:t>
+        <w:t xml:space="preserve">saisonnière et des indicateurs de capacité ; leur interprétation décisionnelle est précisée avec les équipes de terrain. Les</w:t>
       </w:r>
       <w:r>
         <w:t xml:space="preserve"> </w:t>
@@ -919,7 +919,7 @@
     </w:p>
     <w:bookmarkEnd w:id="24"/>
     <w:sectPr>
-      <w:pgSz w:w="11906" w:h="16838"/>
+      <w:pgSz w:h="16838" w:w="11906"/>
       <w:pgMar w:top="760" w:right="880" w:bottom="760" w:left="880" w:header="708" w:footer="708" w:gutter="0"/>
     </w:sectPr>
   </w:body>
@@ -1724,7 +1724,7 @@
       <w:color w:themeColor="accent1" w:themeShade="BF" w:val="365F91"/>
     </w:rPr>
   </w:style>
-  <w:style w:type="paragraph" w:customStyle="1" w:styleId="SourceCode">
+  <w:style w:customStyle="1" w:styleId="SourceCode" w:type="paragraph">
     <w:name w:val="Source Code"/>
     <w:basedOn w:val="Normal"/>
     <w:link w:val="VerbatimChar"/>
@@ -1732,7 +1732,7 @@
       <w:wordWrap w:val="off"/>
     </w:pPr>
   </w:style>
-  <w:style w:type="character" w:customStyle="1" w:styleId="KeywordTok">
+  <w:style w:customStyle="1" w:styleId="KeywordTok" w:type="character">
     <w:name w:val="KeywordTok"/>
     <w:basedOn w:val="VerbatimChar"/>
     <w:rPr>
@@ -1740,77 +1740,77 @@
       <w:b/>
     </w:rPr>
   </w:style>
-  <w:style w:type="character" w:customStyle="1" w:styleId="DataTypeTok">
+  <w:style w:customStyle="1" w:styleId="DataTypeTok" w:type="character">
     <w:name w:val="DataTypeTok"/>
     <w:basedOn w:val="VerbatimChar"/>
     <w:rPr>
       <w:color w:val="902000"/>
     </w:rPr>
   </w:style>
-  <w:style w:type="character" w:customStyle="1" w:styleId="DecValTok">
+  <w:style w:customStyle="1" w:styleId="DecValTok" w:type="character">
     <w:name w:val="DecValTok"/>
     <w:basedOn w:val="VerbatimChar"/>
     <w:rPr>
       <w:color w:val="40a070"/>
     </w:rPr>
   </w:style>
-  <w:style w:type="character" w:customStyle="1" w:styleId="BaseNTok">
+  <w:style w:customStyle="1" w:styleId="BaseNTok" w:type="character">
     <w:name w:val="BaseNTok"/>
     <w:basedOn w:val="VerbatimChar"/>
     <w:rPr>
       <w:color w:val="40a070"/>
     </w:rPr>
   </w:style>
-  <w:style w:type="character" w:customStyle="1" w:styleId="FloatTok">
+  <w:style w:customStyle="1" w:styleId="FloatTok" w:type="character">
     <w:name w:val="FloatTok"/>
     <w:basedOn w:val="VerbatimChar"/>
     <w:rPr>
       <w:color w:val="40a070"/>
     </w:rPr>
   </w:style>
-  <w:style w:type="character" w:customStyle="1" w:styleId="ConstantTok">
+  <w:style w:customStyle="1" w:styleId="ConstantTok" w:type="character">
     <w:name w:val="ConstantTok"/>
     <w:basedOn w:val="VerbatimChar"/>
     <w:rPr>
       <w:color w:val="880000"/>
     </w:rPr>
   </w:style>
-  <w:style w:type="character" w:customStyle="1" w:styleId="CharTok">
+  <w:style w:customStyle="1" w:styleId="CharTok" w:type="character">
     <w:name w:val="CharTok"/>
     <w:basedOn w:val="VerbatimChar"/>
     <w:rPr>
       <w:color w:val="4070a0"/>
     </w:rPr>
   </w:style>
-  <w:style w:type="character" w:customStyle="1" w:styleId="SpecialCharTok">
+  <w:style w:customStyle="1" w:styleId="SpecialCharTok" w:type="character">
     <w:name w:val="SpecialCharTok"/>
     <w:basedOn w:val="VerbatimChar"/>
     <w:rPr>
       <w:color w:val="4070a0"/>
     </w:rPr>
   </w:style>
-  <w:style w:type="character" w:customStyle="1" w:styleId="StringTok">
+  <w:style w:customStyle="1" w:styleId="StringTok" w:type="character">
     <w:name w:val="StringTok"/>
     <w:basedOn w:val="VerbatimChar"/>
     <w:rPr>
       <w:color w:val="4070a0"/>
     </w:rPr>
   </w:style>
-  <w:style w:type="character" w:customStyle="1" w:styleId="VerbatimStringTok">
+  <w:style w:customStyle="1" w:styleId="VerbatimStringTok" w:type="character">
     <w:name w:val="VerbatimStringTok"/>
     <w:basedOn w:val="VerbatimChar"/>
     <w:rPr>
       <w:color w:val="4070a0"/>
     </w:rPr>
   </w:style>
-  <w:style w:type="character" w:customStyle="1" w:styleId="SpecialStringTok">
+  <w:style w:customStyle="1" w:styleId="SpecialStringTok" w:type="character">
     <w:name w:val="SpecialStringTok"/>
     <w:basedOn w:val="VerbatimChar"/>
     <w:rPr>
       <w:color w:val="bb6688"/>
     </w:rPr>
   </w:style>
-  <w:style w:type="character" w:customStyle="1" w:styleId="ImportTok">
+  <w:style w:customStyle="1" w:styleId="ImportTok" w:type="character">
     <w:name w:val="ImportTok"/>
     <w:basedOn w:val="VerbatimChar"/>
     <w:rPr>
@@ -1818,7 +1818,7 @@
       <w:b/>
     </w:rPr>
   </w:style>
-  <w:style w:type="character" w:customStyle="1" w:styleId="CommentTok">
+  <w:style w:customStyle="1" w:styleId="CommentTok" w:type="character">
     <w:name w:val="CommentTok"/>
     <w:basedOn w:val="VerbatimChar"/>
     <w:rPr>
@@ -1826,7 +1826,7 @@
       <w:i/>
     </w:rPr>
   </w:style>
-  <w:style w:type="character" w:customStyle="1" w:styleId="DocumentationTok">
+  <w:style w:customStyle="1" w:styleId="DocumentationTok" w:type="character">
     <w:name w:val="DocumentationTok"/>
     <w:basedOn w:val="VerbatimChar"/>
     <w:rPr>
@@ -1834,7 +1834,7 @@
       <w:i/>
     </w:rPr>
   </w:style>
-  <w:style w:type="character" w:customStyle="1" w:styleId="AnnotationTok">
+  <w:style w:customStyle="1" w:styleId="AnnotationTok" w:type="character">
     <w:name w:val="AnnotationTok"/>
     <w:basedOn w:val="VerbatimChar"/>
     <w:rPr>
@@ -1843,7 +1843,7 @@
       <w:i/>
     </w:rPr>
   </w:style>
-  <w:style w:type="character" w:customStyle="1" w:styleId="CommentVarTok">
+  <w:style w:customStyle="1" w:styleId="CommentVarTok" w:type="character">
     <w:name w:val="CommentVarTok"/>
     <w:basedOn w:val="VerbatimChar"/>
     <w:rPr>
@@ -1852,28 +1852,28 @@
       <w:i/>
     </w:rPr>
   </w:style>
-  <w:style w:type="character" w:customStyle="1" w:styleId="OtherTok">
+  <w:style w:customStyle="1" w:styleId="OtherTok" w:type="character">
     <w:name w:val="OtherTok"/>
     <w:basedOn w:val="VerbatimChar"/>
     <w:rPr>
       <w:color w:val="007020"/>
     </w:rPr>
   </w:style>
-  <w:style w:type="character" w:customStyle="1" w:styleId="FunctionTok">
+  <w:style w:customStyle="1" w:styleId="FunctionTok" w:type="character">
     <w:name w:val="FunctionTok"/>
     <w:basedOn w:val="VerbatimChar"/>
     <w:rPr>
       <w:color w:val="06287e"/>
     </w:rPr>
   </w:style>
-  <w:style w:type="character" w:customStyle="1" w:styleId="VariableTok">
+  <w:style w:customStyle="1" w:styleId="VariableTok" w:type="character">
     <w:name w:val="VariableTok"/>
     <w:basedOn w:val="VerbatimChar"/>
     <w:rPr>
       <w:color w:val="19177c"/>
     </w:rPr>
   </w:style>
-  <w:style w:type="character" w:customStyle="1" w:styleId="ControlFlowTok">
+  <w:style w:customStyle="1" w:styleId="ControlFlowTok" w:type="character">
     <w:name w:val="ControlFlowTok"/>
     <w:basedOn w:val="VerbatimChar"/>
     <w:rPr>
@@ -1881,45 +1881,45 @@
       <w:b/>
     </w:rPr>
   </w:style>
-  <w:style w:type="character" w:customStyle="1" w:styleId="OperatorTok">
+  <w:style w:customStyle="1" w:styleId="OperatorTok" w:type="character">
     <w:name w:val="OperatorTok"/>
     <w:basedOn w:val="VerbatimChar"/>
     <w:rPr>
       <w:color w:val="666666"/>
     </w:rPr>
   </w:style>
-  <w:style w:type="character" w:customStyle="1" w:styleId="BuiltInTok">
+  <w:style w:customStyle="1" w:styleId="BuiltInTok" w:type="character">
     <w:name w:val="BuiltInTok"/>
     <w:basedOn w:val="VerbatimChar"/>
     <w:rPr>
       <w:color w:val="008000"/>
     </w:rPr>
   </w:style>
-  <w:style w:type="character" w:customStyle="1" w:styleId="ExtensionTok">
+  <w:style w:customStyle="1" w:styleId="ExtensionTok" w:type="character">
     <w:name w:val="ExtensionTok"/>
     <w:basedOn w:val="VerbatimChar"/>
     <w:rPr/>
   </w:style>
-  <w:style w:type="character" w:customStyle="1" w:styleId="PreprocessorTok">
+  <w:style w:customStyle="1" w:styleId="PreprocessorTok" w:type="character">
     <w:name w:val="PreprocessorTok"/>
     <w:basedOn w:val="VerbatimChar"/>
     <w:rPr>
       <w:color w:val="bc7a00"/>
     </w:rPr>
   </w:style>
-  <w:style w:type="character" w:customStyle="1" w:styleId="AttributeTok">
+  <w:style w:customStyle="1" w:styleId="AttributeTok" w:type="character">
     <w:name w:val="AttributeTok"/>
     <w:basedOn w:val="VerbatimChar"/>
     <w:rPr>
       <w:color w:val="7d9029"/>
     </w:rPr>
   </w:style>
-  <w:style w:type="character" w:customStyle="1" w:styleId="RegionMarkerTok">
+  <w:style w:customStyle="1" w:styleId="RegionMarkerTok" w:type="character">
     <w:name w:val="RegionMarkerTok"/>
     <w:basedOn w:val="VerbatimChar"/>
     <w:rPr/>
   </w:style>
-  <w:style w:type="character" w:customStyle="1" w:styleId="InformationTok">
+  <w:style w:customStyle="1" w:styleId="InformationTok" w:type="character">
     <w:name w:val="InformationTok"/>
     <w:basedOn w:val="VerbatimChar"/>
     <w:rPr>
@@ -1928,7 +1928,7 @@
       <w:i/>
     </w:rPr>
   </w:style>
-  <w:style w:type="character" w:customStyle="1" w:styleId="WarningTok">
+  <w:style w:customStyle="1" w:styleId="WarningTok" w:type="character">
     <w:name w:val="WarningTok"/>
     <w:basedOn w:val="VerbatimChar"/>
     <w:rPr>
@@ -1937,7 +1937,7 @@
       <w:i/>
     </w:rPr>
   </w:style>
-  <w:style w:type="character" w:customStyle="1" w:styleId="AlertTok">
+  <w:style w:customStyle="1" w:styleId="AlertTok" w:type="character">
     <w:name w:val="AlertTok"/>
     <w:basedOn w:val="VerbatimChar"/>
     <w:rPr>
@@ -1945,7 +1945,7 @@
       <w:b/>
     </w:rPr>
   </w:style>
-  <w:style w:type="character" w:customStyle="1" w:styleId="ErrorTok">
+  <w:style w:customStyle="1" w:styleId="ErrorTok" w:type="character">
     <w:name w:val="ErrorTok"/>
     <w:basedOn w:val="VerbatimChar"/>
     <w:rPr>
@@ -1953,7 +1953,7 @@
       <w:b/>
     </w:rPr>
   </w:style>
-  <w:style w:type="character" w:customStyle="1" w:styleId="NormalTok">
+  <w:style w:customStyle="1" w:styleId="NormalTok" w:type="character">
     <w:name w:val="NormalTok"/>
     <w:basedOn w:val="VerbatimChar"/>
     <w:rPr/>

</xml_diff>

<commit_message>
English two-page note for Teodoro; FR notes synced to the end-to-end question and verified-loop end state
Co-Authored-By: Claude Fable 5 <noreply@anthropic.com>
Claude-Session: https://claude.ai/code/session_01Pijyy83JyS8bJxoVQgxwZB
</commit_message>
<xml_diff>
--- a/04-other-documents/data-access/02-project-note.docx
+++ b/04-other-documents/data-access/02-project-note.docx
@@ -98,7 +98,13 @@
         <w:t xml:space="preserve"> </w:t>
       </w:r>
       <w:r>
-        <w:t xml:space="preserve">aide ou nuit. C’est la question centrale du projet, posée de façon falsifiable.</w:t>
+        <w:t xml:space="preserve">aide ou nuit. C’est la question centrale du projet, posée de façon falsifiable, de</w:t>
+      </w:r>
+      <w:r>
+        <w:t xml:space="preserve"> </w:t>
+      </w:r>
+      <w:r>
+        <w:t xml:space="preserve">l’extraction jusqu’au système qui tourne et se vérifie.</w:t>
       </w:r>
     </w:p>
     <w:bookmarkEnd w:id="20"/>
@@ -280,13 +286,13 @@
         <w:t xml:space="preserve"> </w:t>
       </w:r>
       <w:r>
-        <w:t xml:space="preserve">extraction avec provenance), que le projet transforme en instrument validé. La littérature</w:t>
-      </w:r>
-      <w:r>
-        <w:t xml:space="preserve"> </w:t>
-      </w:r>
-      <w:r>
-        <w:t xml:space="preserve">fournit aussi les variables pertinentes, les familles de modèles recommandées et les</w:t>
+        <w:t xml:space="preserve">extraction avec provenance), transformé en instrument validé. La littérature</w:t>
+      </w:r>
+      <w:r>
+        <w:t xml:space="preserve"> </w:t>
+      </w:r>
+      <w:r>
+        <w:t xml:space="preserve">fournit aussi les variables explicatives, les familles de modèles recommandées et les</w:t>
       </w:r>
       <w:r>
         <w:t xml:space="preserve"> </w:t>
@@ -655,7 +661,7 @@
         <w:t xml:space="preserve"> </w:t>
       </w:r>
       <w:r>
-        <w:t xml:space="preserve">de données genevois (144, urgences, soins intensifs, médecin et pharmacien cantonaux).</w:t>
+        <w:t xml:space="preserve">de données genevois.</w:t>
       </w:r>
     </w:p>
     <w:p>
@@ -734,13 +740,7 @@
         <w:t xml:space="preserve"> </w:t>
       </w:r>
       <w:r>
-        <w:t xml:space="preserve">(confirmant la collaboration et sa contribution concrète - le FNS écarte les lettres de</w:t>
-      </w:r>
-      <w:r>
-        <w:t xml:space="preserve"> </w:t>
-      </w:r>
-      <w:r>
-        <w:t xml:space="preserve">recommandation), et un</w:t>
+        <w:t xml:space="preserve">(le FNS écarte les lettres de recommandation), et un</w:t>
       </w:r>
       <w:r>
         <w:t xml:space="preserve"> </w:t>
@@ -756,7 +756,13 @@
         <w:t xml:space="preserve"> </w:t>
       </w:r>
       <w:r>
-        <w:t xml:space="preserve">sur cette voie officielle le moment venu.</w:t>
+        <w:t xml:space="preserve">sur cette voie</w:t>
+      </w:r>
+      <w:r>
+        <w:t xml:space="preserve"> </w:t>
+      </w:r>
+      <w:r>
+        <w:t xml:space="preserve">officielle le moment venu.</w:t>
       </w:r>
       <w:r>
         <w:t xml:space="preserve"> </w:t>
@@ -872,13 +878,19 @@
         <w:t xml:space="preserve"> </w:t>
       </w:r>
       <w:r>
-        <w:t xml:space="preserve">intensifs) : états et prévisions rafraîchis automatiquement, enregistrés, jamais décisionnels</w:t>
-      </w:r>
-      <w:r>
-        <w:t xml:space="preserve"> </w:t>
-      </w:r>
-      <w:r>
-        <w:t xml:space="preserve">pendant le projet ; le noyau d’une future plateforme de surveillance.</w:t>
+        <w:t xml:space="preserve">intensifs) : états et prévisions rafraîchis automatiquement, enregistrés et évalués</w:t>
+      </w:r>
+      <w:r>
+        <w:t xml:space="preserve"> </w:t>
+      </w:r>
+      <w:r>
+        <w:t xml:space="preserve">prospectivement, jamais décisionnels pendant le projet ; le noyau d’une future plateforme</w:t>
+      </w:r>
+      <w:r>
+        <w:t xml:space="preserve"> </w:t>
+      </w:r>
+      <w:r>
+        <w:t xml:space="preserve">de surveillance.</w:t>
       </w:r>
     </w:p>
     <w:p>
@@ -908,13 +920,13 @@
         <w:t xml:space="preserve"> </w:t>
       </w:r>
       <w:r>
-        <w:t xml:space="preserve">Dépôt : 3 novembre 2026 · Décision : août 2027 · Début : entre septembre</w:t>
-      </w:r>
-      <w:r>
-        <w:t xml:space="preserve"> </w:t>
-      </w:r>
-      <w:r>
-        <w:t xml:space="preserve">2027 et septembre 2028. Lettre de collaboration souhaitée d’ici la mi-octobre 2026.</w:t>
+        <w:t xml:space="preserve">Dépôt : 3 novembre 2026 · Décision : août 2027 · Début : 2027-2028 ·</w:t>
+      </w:r>
+      <w:r>
+        <w:t xml:space="preserve"> </w:t>
+      </w:r>
+      <w:r>
+        <w:t xml:space="preserve">Lettre de collaboration souhaitée d’ici la mi-octobre 2026.</w:t>
       </w:r>
     </w:p>
     <w:bookmarkEnd w:id="24"/>

</xml_diff>